<commit_message>
add exercise 5 6 to be revised
</commit_message>
<xml_diff>
--- a/SWARD/Exercises/Exercise 5.docx
+++ b/SWARD/Exercises/Exercise 5.docx
@@ -389,31 +389,3469 @@
         <w:t xml:space="preserve">Do: </w:t>
       </w:r>
       <w:r>
-        <w:t>send messages</w:t>
-      </w:r>
-      <w:r>
+        <w:t>send messages, receive messages, establish connection</w:t>
+      </w:r>
+      <w:r>
+        <w:t>.</w:t>
+      </w:r>
+    </w:p>
+    <w:p>
+      <w:pPr>
+        <w:rPr>
+          <w:b/>
+          <w:bCs/>
+        </w:rPr>
+      </w:pPr>
+    </w:p>
+    <w:p>
+      <w:pPr>
+        <w:rPr>
+          <w:b/>
+          <w:bCs/>
+        </w:rPr>
+      </w:pPr>
+    </w:p>
+    <w:p>
+      <w:pPr>
+        <w:rPr>
+          <w:b/>
+          <w:bCs/>
+        </w:rPr>
+      </w:pPr>
+    </w:p>
+    <w:p>
+      <w:pPr>
+        <w:rPr>
+          <w:b/>
+          <w:bCs/>
+        </w:rPr>
+      </w:pPr>
+    </w:p>
+    <w:p>
+      <w:pPr>
+        <w:rPr>
+          <w:b/>
+          <w:bCs/>
+        </w:rPr>
+      </w:pPr>
+    </w:p>
+    <w:p>
+      <w:pPr>
+        <w:rPr>
+          <w:b/>
+          <w:bCs/>
+        </w:rPr>
+      </w:pPr>
+    </w:p>
+    <w:p>
+      <w:pPr>
+        <w:rPr>
+          <w:b/>
+          <w:bCs/>
+        </w:rPr>
+      </w:pPr>
+    </w:p>
+    <w:p>
+      <w:pPr>
+        <w:rPr>
+          <w:b/>
+          <w:bCs/>
+        </w:rPr>
+      </w:pPr>
+    </w:p>
+    <w:p>
+      <w:pPr>
+        <w:rPr>
+          <w:b/>
+          <w:bCs/>
+        </w:rPr>
+      </w:pPr>
+    </w:p>
+    <w:p>
+      <w:pPr>
+        <w:rPr>
+          <w:b/>
+          <w:bCs/>
+        </w:rPr>
+      </w:pPr>
+    </w:p>
+    <w:p>
+      <w:pPr>
+        <w:rPr>
+          <w:b/>
+          <w:bCs/>
+        </w:rPr>
+      </w:pPr>
+    </w:p>
+    <w:p>
+      <w:pPr>
+        <w:rPr>
+          <w:b/>
+          <w:bCs/>
+        </w:rPr>
+      </w:pPr>
+    </w:p>
+    <w:p>
+      <w:pPr>
+        <w:rPr>
+          <w:b/>
+          <w:bCs/>
+        </w:rPr>
+      </w:pPr>
+      <w:r>
+        <w:rPr>
+          <w:b/>
+          <w:bCs/>
+        </w:rPr>
+        <w:lastRenderedPageBreak/>
+        <w:t xml:space="preserve"># Technical Design Documentation - </w:t>
+      </w:r>
+      <w:proofErr w:type="spellStart"/>
+      <w:r>
+        <w:rPr>
+          <w:b/>
+          <w:bCs/>
+        </w:rPr>
+        <w:t>TicTacToe</w:t>
+      </w:r>
+      <w:proofErr w:type="spellEnd"/>
+    </w:p>
+    <w:p>
+      <w:pPr>
+        <w:rPr>
+          <w:b/>
+          <w:bCs/>
+        </w:rPr>
+      </w:pPr>
+    </w:p>
+    <w:p>
+      <w:pPr>
+        <w:rPr>
+          <w:b/>
+          <w:bCs/>
+        </w:rPr>
+      </w:pPr>
+      <w:r>
+        <w:rPr>
+          <w:b/>
+          <w:bCs/>
+        </w:rPr>
+        <w:t>## Project Overview</w:t>
+      </w:r>
+    </w:p>
+    <w:p>
+      <w:pPr>
+        <w:rPr>
+          <w:b/>
+          <w:bCs/>
+        </w:rPr>
+      </w:pPr>
+      <w:r>
+        <w:rPr>
+          <w:b/>
+          <w:bCs/>
+        </w:rPr>
+        <w:t xml:space="preserve">A browser-based </w:t>
+      </w:r>
+      <w:proofErr w:type="spellStart"/>
+      <w:r>
+        <w:rPr>
+          <w:b/>
+          <w:bCs/>
+        </w:rPr>
+        <w:t>TicTacToe</w:t>
+      </w:r>
+      <w:proofErr w:type="spellEnd"/>
+      <w:r>
+        <w:rPr>
+          <w:b/>
+          <w:bCs/>
+        </w:rPr>
+        <w:t xml:space="preserve"> game for 2 players using WebSocket for real-time communication. Players can create or join game sessions and play against each other in real-time.</w:t>
+      </w:r>
+    </w:p>
+    <w:p>
+      <w:pPr>
+        <w:rPr>
+          <w:b/>
+          <w:bCs/>
+        </w:rPr>
+      </w:pPr>
+    </w:p>
+    <w:p>
+      <w:pPr>
+        <w:rPr>
+          <w:b/>
+          <w:bCs/>
+        </w:rPr>
+      </w:pPr>
+      <w:r>
+        <w:rPr>
+          <w:b/>
+          <w:bCs/>
+        </w:rPr>
+        <w:t>## Architecture Overview</w:t>
+      </w:r>
+    </w:p>
+    <w:p>
+      <w:pPr>
+        <w:rPr>
+          <w:b/>
+          <w:bCs/>
+        </w:rPr>
+      </w:pPr>
+      <w:r>
+        <w:rPr>
+          <w:b/>
+          <w:bCs/>
+        </w:rPr>
+        <w:t>- **Backend**: Spring Boot (Java) - REST API + WebSocket</w:t>
+      </w:r>
+    </w:p>
+    <w:p>
+      <w:pPr>
+        <w:rPr>
+          <w:b/>
+          <w:bCs/>
+        </w:rPr>
+      </w:pPr>
+      <w:r>
+        <w:rPr>
+          <w:b/>
+          <w:bCs/>
+        </w:rPr>
+        <w:t>- **Frontend**: HTML, CSS, JavaScript (Vanilla)</w:t>
+      </w:r>
+    </w:p>
+    <w:p>
+      <w:pPr>
+        <w:rPr>
+          <w:b/>
+          <w:bCs/>
+        </w:rPr>
+      </w:pPr>
+      <w:r>
+        <w:rPr>
+          <w:b/>
+          <w:bCs/>
+        </w:rPr>
+        <w:t>- **Communication**: REST for session management, WebSocket for real-time gameplay</w:t>
+      </w:r>
+    </w:p>
+    <w:p>
+      <w:pPr>
+        <w:rPr>
+          <w:b/>
+          <w:bCs/>
+        </w:rPr>
+      </w:pPr>
+      <w:r>
+        <w:rPr>
+          <w:b/>
+          <w:bCs/>
+        </w:rPr>
+        <w:t>- **Build Tool**: Maven</w:t>
+      </w:r>
+    </w:p>
+    <w:p>
+      <w:pPr>
+        <w:rPr>
+          <w:b/>
+          <w:bCs/>
+        </w:rPr>
+      </w:pPr>
+    </w:p>
+    <w:p>
+      <w:pPr>
+        <w:rPr>
+          <w:b/>
+          <w:bCs/>
+        </w:rPr>
+      </w:pPr>
+      <w:r>
+        <w:rPr>
+          <w:b/>
+          <w:bCs/>
+        </w:rPr>
+        <w:t>---</w:t>
+      </w:r>
+    </w:p>
+    <w:p>
+      <w:pPr>
+        <w:rPr>
+          <w:b/>
+          <w:bCs/>
+        </w:rPr>
+      </w:pPr>
+    </w:p>
+    <w:p>
+      <w:pPr>
+        <w:rPr>
+          <w:b/>
+          <w:bCs/>
+        </w:rPr>
+      </w:pPr>
+      <w:r>
+        <w:rPr>
+          <w:b/>
+          <w:bCs/>
+        </w:rPr>
+        <w:t>## Design Patterns Applied</w:t>
+      </w:r>
+    </w:p>
+    <w:p>
+      <w:pPr>
+        <w:rPr>
+          <w:b/>
+          <w:bCs/>
+        </w:rPr>
+      </w:pPr>
+    </w:p>
+    <w:p>
+      <w:pPr>
+        <w:rPr>
+          <w:b/>
+          <w:bCs/>
+        </w:rPr>
+      </w:pPr>
+      <w:r>
+        <w:rPr>
+          <w:b/>
+          <w:bCs/>
+        </w:rPr>
+        <w:t>### 1. MVC (Model-View-Controller)</w:t>
+      </w:r>
+    </w:p>
+    <w:p>
+      <w:pPr>
+        <w:rPr>
+          <w:b/>
+          <w:bCs/>
+        </w:rPr>
+      </w:pPr>
+      <w:r>
+        <w:rPr>
+          <w:b/>
+          <w:bCs/>
+        </w:rPr>
+        <w:t xml:space="preserve">**Source**: </w:t>
+      </w:r>
+    </w:p>
+    <w:p>
+      <w:pPr>
+        <w:rPr>
+          <w:b/>
+          <w:bCs/>
+        </w:rPr>
+      </w:pPr>
+      <w:r>
+        <w:rPr>
+          <w:b/>
+          <w:bCs/>
+        </w:rPr>
+        <w:t>- Model: `com.beshoy.tictactoe.model.GameBoard.java`, `com.beshoy.tictactoe.model.Player.java`</w:t>
+      </w:r>
+    </w:p>
+    <w:p>
+      <w:pPr>
+        <w:rPr>
+          <w:b/>
+          <w:bCs/>
+        </w:rPr>
+      </w:pPr>
+      <w:r>
+        <w:rPr>
+          <w:b/>
+          <w:bCs/>
+        </w:rPr>
+        <w:t>- View: `</w:t>
+      </w:r>
+      <w:proofErr w:type="spellStart"/>
+      <w:r>
+        <w:rPr>
+          <w:b/>
+          <w:bCs/>
+        </w:rPr>
+        <w:t>src</w:t>
+      </w:r>
+      <w:proofErr w:type="spellEnd"/>
+      <w:r>
+        <w:rPr>
+          <w:b/>
+          <w:bCs/>
+        </w:rPr>
+        <w:t>/main/resources/static/index.html`, `style.css`</w:t>
+      </w:r>
+    </w:p>
+    <w:p>
+      <w:pPr>
+        <w:rPr>
+          <w:b/>
+          <w:bCs/>
+        </w:rPr>
+      </w:pPr>
+      <w:r>
+        <w:rPr>
+          <w:b/>
+          <w:bCs/>
+        </w:rPr>
+        <w:t>- Controller: `com.beshoy.tictactoe.controller.GameApiController.java`</w:t>
+      </w:r>
+    </w:p>
+    <w:p>
+      <w:pPr>
+        <w:rPr>
+          <w:b/>
+          <w:bCs/>
+        </w:rPr>
+      </w:pPr>
+    </w:p>
+    <w:p>
+      <w:pPr>
+        <w:rPr>
+          <w:b/>
+          <w:bCs/>
+        </w:rPr>
+      </w:pPr>
+      <w:r>
+        <w:rPr>
+          <w:b/>
+          <w:bCs/>
+        </w:rPr>
+        <w:t>**Description**: The application follows the MVC pattern where Model classes handle business logic and data, View handles the presentation layer, and Controller handles HTTP requests and orchestrates the flow between Model and View.</w:t>
+      </w:r>
+    </w:p>
+    <w:p>
+      <w:pPr>
+        <w:rPr>
+          <w:b/>
+          <w:bCs/>
+        </w:rPr>
+      </w:pPr>
+    </w:p>
+    <w:p>
+      <w:pPr>
+        <w:rPr>
+          <w:b/>
+          <w:bCs/>
+        </w:rPr>
+      </w:pPr>
+      <w:r>
+        <w:rPr>
+          <w:b/>
+          <w:bCs/>
+        </w:rPr>
+        <w:t>---</w:t>
+      </w:r>
+    </w:p>
+    <w:p>
+      <w:pPr>
+        <w:rPr>
+          <w:b/>
+          <w:bCs/>
+        </w:rPr>
+      </w:pPr>
+    </w:p>
+    <w:p>
+      <w:pPr>
+        <w:rPr>
+          <w:b/>
+          <w:bCs/>
+        </w:rPr>
+      </w:pPr>
+      <w:r>
+        <w:rPr>
+          <w:b/>
+          <w:bCs/>
+        </w:rPr>
+        <w:t>### 2. Singleton Pattern</w:t>
+      </w:r>
+    </w:p>
+    <w:p>
+      <w:pPr>
+        <w:rPr>
+          <w:b/>
+          <w:bCs/>
+        </w:rPr>
+      </w:pPr>
+      <w:r>
+        <w:rPr>
+          <w:b/>
+          <w:bCs/>
+        </w:rPr>
+        <w:t>**Source**: `com.beshoy.tictactoe.service.GameSessionManager.java`</w:t>
+      </w:r>
+    </w:p>
+    <w:p>
+      <w:pPr>
+        <w:rPr>
+          <w:b/>
+          <w:bCs/>
+        </w:rPr>
+      </w:pPr>
+    </w:p>
+    <w:p>
+      <w:pPr>
+        <w:rPr>
+          <w:b/>
+          <w:bCs/>
+        </w:rPr>
+      </w:pPr>
+      <w:r>
+        <w:rPr>
+          <w:b/>
+          <w:bCs/>
+        </w:rPr>
+        <w:lastRenderedPageBreak/>
+        <w:t>**Description**: `</w:t>
+      </w:r>
+      <w:proofErr w:type="spellStart"/>
+      <w:r>
+        <w:rPr>
+          <w:b/>
+          <w:bCs/>
+        </w:rPr>
+        <w:t>GameSessionManager</w:t>
+      </w:r>
+      <w:proofErr w:type="spellEnd"/>
+      <w:r>
+        <w:rPr>
+          <w:b/>
+          <w:bCs/>
+        </w:rPr>
+        <w:t>` is implemented as a Spring `@Service` (singleton) that manages all game sessions. Only one instance exists throughout the application lifecycle, ensuring centralized session management across the entire application.</w:t>
+      </w:r>
+    </w:p>
+    <w:p>
+      <w:pPr>
+        <w:rPr>
+          <w:b/>
+          <w:bCs/>
+        </w:rPr>
+      </w:pPr>
+    </w:p>
+    <w:p>
+      <w:pPr>
+        <w:rPr>
+          <w:b/>
+          <w:bCs/>
+        </w:rPr>
+      </w:pPr>
+      <w:r>
+        <w:rPr>
+          <w:b/>
+          <w:bCs/>
+        </w:rPr>
+        <w:t>---</w:t>
+      </w:r>
+    </w:p>
+    <w:p>
+      <w:pPr>
+        <w:rPr>
+          <w:b/>
+          <w:bCs/>
+        </w:rPr>
+      </w:pPr>
+    </w:p>
+    <w:p>
+      <w:pPr>
+        <w:rPr>
+          <w:b/>
+          <w:bCs/>
+        </w:rPr>
+      </w:pPr>
+      <w:r>
+        <w:rPr>
+          <w:b/>
+          <w:bCs/>
+        </w:rPr>
+        <w:t>### 3. Factory Pattern</w:t>
+      </w:r>
+    </w:p>
+    <w:p>
+      <w:pPr>
+        <w:rPr>
+          <w:b/>
+          <w:bCs/>
+        </w:rPr>
+      </w:pPr>
+      <w:r>
+        <w:rPr>
+          <w:b/>
+          <w:bCs/>
+        </w:rPr>
+        <w:t>**Source**: `com.beshoy.tictactoe.service.GameSession.java` (</w:t>
+      </w:r>
+      <w:proofErr w:type="spellStart"/>
+      <w:r>
+        <w:rPr>
+          <w:b/>
+          <w:bCs/>
+        </w:rPr>
+        <w:t>createFirstPlayer</w:t>
+      </w:r>
+      <w:proofErr w:type="spellEnd"/>
+      <w:r>
+        <w:rPr>
+          <w:b/>
+          <w:bCs/>
+        </w:rPr>
+        <w:t xml:space="preserve"> method)</w:t>
+      </w:r>
+    </w:p>
+    <w:p>
+      <w:pPr>
+        <w:rPr>
+          <w:b/>
+          <w:bCs/>
+        </w:rPr>
+      </w:pPr>
+    </w:p>
+    <w:p>
+      <w:pPr>
+        <w:rPr>
+          <w:b/>
+          <w:bCs/>
+        </w:rPr>
+      </w:pPr>
+      <w:r>
+        <w:rPr>
+          <w:b/>
+          <w:bCs/>
+        </w:rPr>
+        <w:t>**Description**: The `</w:t>
+      </w:r>
+      <w:proofErr w:type="spellStart"/>
+      <w:r>
+        <w:rPr>
+          <w:b/>
+          <w:bCs/>
+        </w:rPr>
+        <w:t>createFirstPlayer</w:t>
+      </w:r>
+      <w:proofErr w:type="spellEnd"/>
+      <w:r>
+        <w:rPr>
+          <w:b/>
+          <w:bCs/>
+        </w:rPr>
+        <w:t>` method acts as a factory method that creates and initializes a new Player object with the specified symbol and name, ensuring proper validation before creation. This encapsulates the object creation logic.</w:t>
+      </w:r>
+    </w:p>
+    <w:p>
+      <w:pPr>
+        <w:rPr>
+          <w:b/>
+          <w:bCs/>
+        </w:rPr>
+      </w:pPr>
+    </w:p>
+    <w:p>
+      <w:pPr>
+        <w:rPr>
+          <w:b/>
+          <w:bCs/>
+        </w:rPr>
+      </w:pPr>
+      <w:r>
+        <w:rPr>
+          <w:b/>
+          <w:bCs/>
+        </w:rPr>
+        <w:t>---</w:t>
+      </w:r>
+    </w:p>
+    <w:p>
+      <w:pPr>
+        <w:rPr>
+          <w:b/>
+          <w:bCs/>
+        </w:rPr>
+      </w:pPr>
+    </w:p>
+    <w:p>
+      <w:pPr>
+        <w:rPr>
+          <w:b/>
+          <w:bCs/>
+        </w:rPr>
+      </w:pPr>
+      <w:r>
+        <w:rPr>
+          <w:b/>
+          <w:bCs/>
+        </w:rPr>
+        <w:t>### 4. Observer Pattern</w:t>
+      </w:r>
+    </w:p>
+    <w:p>
+      <w:pPr>
+        <w:rPr>
+          <w:b/>
+          <w:bCs/>
+        </w:rPr>
+      </w:pPr>
+      <w:r>
+        <w:rPr>
+          <w:b/>
+          <w:bCs/>
+        </w:rPr>
+        <w:t>**Source**: `com.beshoy.tictactoe.websocket.GameWebSocketHandler.java`</w:t>
+      </w:r>
+    </w:p>
+    <w:p>
+      <w:pPr>
+        <w:rPr>
+          <w:b/>
+          <w:bCs/>
+        </w:rPr>
+      </w:pPr>
+    </w:p>
+    <w:p>
+      <w:pPr>
+        <w:rPr>
+          <w:b/>
+          <w:bCs/>
+        </w:rPr>
+      </w:pPr>
+      <w:r>
+        <w:rPr>
+          <w:b/>
+          <w:bCs/>
+        </w:rPr>
+        <w:t>**Description**: Implements the Observer pattern where:</w:t>
+      </w:r>
+    </w:p>
+    <w:p>
+      <w:pPr>
+        <w:rPr>
+          <w:b/>
+          <w:bCs/>
+        </w:rPr>
+      </w:pPr>
+      <w:r>
+        <w:rPr>
+          <w:b/>
+          <w:bCs/>
+        </w:rPr>
+        <w:t>- The WebSocket handler acts as the subject (observable)</w:t>
+      </w:r>
+    </w:p>
+    <w:p>
+      <w:pPr>
+        <w:rPr>
+          <w:b/>
+          <w:bCs/>
+        </w:rPr>
+      </w:pPr>
+      <w:r>
+        <w:rPr>
+          <w:b/>
+          <w:bCs/>
+        </w:rPr>
+        <w:t>- Each connected WebSocket session is an observer</w:t>
+      </w:r>
+    </w:p>
+    <w:p>
+      <w:pPr>
+        <w:rPr>
+          <w:b/>
+          <w:bCs/>
+        </w:rPr>
+      </w:pPr>
+      <w:r>
+        <w:rPr>
+          <w:b/>
+          <w:bCs/>
+        </w:rPr>
+        <w:t>- When game state changes (a move is made), all observers (players) are notified via broadcast messages</w:t>
+      </w:r>
+    </w:p>
+    <w:p>
+      <w:pPr>
+        <w:rPr>
+          <w:b/>
+          <w:bCs/>
+        </w:rPr>
+      </w:pPr>
+      <w:r>
+        <w:rPr>
+          <w:b/>
+          <w:bCs/>
+        </w:rPr>
+        <w:t>- This enables real-time updates without polling</w:t>
+      </w:r>
+    </w:p>
+    <w:p>
+      <w:pPr>
+        <w:rPr>
+          <w:b/>
+          <w:bCs/>
+        </w:rPr>
+      </w:pPr>
+    </w:p>
+    <w:p>
+      <w:pPr>
+        <w:rPr>
+          <w:b/>
+          <w:bCs/>
+        </w:rPr>
+      </w:pPr>
+      <w:r>
+        <w:rPr>
+          <w:b/>
+          <w:bCs/>
+        </w:rPr>
+        <w:t>---</w:t>
+      </w:r>
+    </w:p>
+    <w:p>
+      <w:pPr>
+        <w:rPr>
+          <w:b/>
+          <w:bCs/>
+        </w:rPr>
+      </w:pPr>
+    </w:p>
+    <w:p>
+      <w:pPr>
+        <w:rPr>
+          <w:b/>
+          <w:bCs/>
+        </w:rPr>
+      </w:pPr>
+      <w:r>
+        <w:rPr>
+          <w:b/>
+          <w:bCs/>
+        </w:rPr>
+        <w:t>### 5. Strategy Pattern</w:t>
+      </w:r>
+    </w:p>
+    <w:p>
+      <w:pPr>
+        <w:rPr>
+          <w:b/>
+          <w:bCs/>
+        </w:rPr>
+      </w:pPr>
+      <w:r>
+        <w:rPr>
+          <w:b/>
+          <w:bCs/>
+        </w:rPr>
+        <w:t>**Source**: `com.beshoy.tictactoe.model.GameBoard.java` (</w:t>
+      </w:r>
+      <w:proofErr w:type="spellStart"/>
+      <w:r>
+        <w:rPr>
+          <w:b/>
+          <w:bCs/>
+        </w:rPr>
+        <w:t>checkWinner</w:t>
+      </w:r>
+      <w:proofErr w:type="spellEnd"/>
+      <w:r>
+        <w:rPr>
+          <w:b/>
+          <w:bCs/>
+        </w:rPr>
+        <w:t xml:space="preserve"> method)</w:t>
+      </w:r>
+    </w:p>
+    <w:p>
+      <w:pPr>
+        <w:rPr>
+          <w:b/>
+          <w:bCs/>
+        </w:rPr>
+      </w:pPr>
+    </w:p>
+    <w:p>
+      <w:pPr>
+        <w:rPr>
+          <w:b/>
+          <w:bCs/>
+        </w:rPr>
+      </w:pPr>
+      <w:r>
+        <w:rPr>
+          <w:b/>
+          <w:bCs/>
+        </w:rPr>
+        <w:t>**Description**: The game uses different strategies to check for winners:</w:t>
+      </w:r>
+    </w:p>
+    <w:p>
+      <w:pPr>
+        <w:rPr>
+          <w:b/>
+          <w:bCs/>
+        </w:rPr>
+      </w:pPr>
+      <w:r>
+        <w:rPr>
+          <w:b/>
+          <w:bCs/>
+        </w:rPr>
+        <w:t>- Horizontal strategy (checking rows)</w:t>
+      </w:r>
+    </w:p>
+    <w:p>
+      <w:pPr>
+        <w:rPr>
+          <w:b/>
+          <w:bCs/>
+        </w:rPr>
+      </w:pPr>
+      <w:r>
+        <w:rPr>
+          <w:b/>
+          <w:bCs/>
+        </w:rPr>
+        <w:lastRenderedPageBreak/>
+        <w:t xml:space="preserve">- Vertical strategy (checking columns)  </w:t>
+      </w:r>
+    </w:p>
+    <w:p>
+      <w:pPr>
+        <w:rPr>
+          <w:b/>
+          <w:bCs/>
+        </w:rPr>
+      </w:pPr>
+      <w:r>
+        <w:rPr>
+          <w:b/>
+          <w:bCs/>
+        </w:rPr>
+        <w:t>- Diagonal strategy (checking both diagonals)</w:t>
+      </w:r>
+    </w:p>
+    <w:p>
+      <w:pPr>
+        <w:rPr>
+          <w:b/>
+          <w:bCs/>
+        </w:rPr>
+      </w:pPr>
+      <w:r>
+        <w:rPr>
+          <w:b/>
+          <w:bCs/>
+        </w:rPr>
+        <w:t>The `</w:t>
+      </w:r>
+      <w:proofErr w:type="spellStart"/>
+      <w:r>
+        <w:rPr>
+          <w:b/>
+          <w:bCs/>
+        </w:rPr>
+        <w:t>checkWinner</w:t>
+      </w:r>
+      <w:proofErr w:type="spellEnd"/>
+      <w:r>
+        <w:rPr>
+          <w:b/>
+          <w:bCs/>
+        </w:rPr>
+        <w:t>` method encapsulates these different winning strategies and applies them sequentially. New winning strategies can be added without modifying existing code.</w:t>
+      </w:r>
+    </w:p>
+    <w:p>
+      <w:pPr>
+        <w:rPr>
+          <w:b/>
+          <w:bCs/>
+        </w:rPr>
+      </w:pPr>
+    </w:p>
+    <w:p>
+      <w:pPr>
+        <w:rPr>
+          <w:b/>
+          <w:bCs/>
+        </w:rPr>
+      </w:pPr>
+      <w:r>
+        <w:rPr>
+          <w:b/>
+          <w:bCs/>
+        </w:rPr>
+        <w:t>---</w:t>
+      </w:r>
+    </w:p>
+    <w:p>
+      <w:pPr>
+        <w:rPr>
+          <w:b/>
+          <w:bCs/>
+        </w:rPr>
+      </w:pPr>
+    </w:p>
+    <w:p>
+      <w:pPr>
+        <w:rPr>
+          <w:b/>
+          <w:bCs/>
+        </w:rPr>
+      </w:pPr>
+      <w:r>
+        <w:rPr>
+          <w:b/>
+          <w:bCs/>
+        </w:rPr>
+        <w:t>## GRASP Patterns Applied</w:t>
+      </w:r>
+    </w:p>
+    <w:p>
+      <w:pPr>
+        <w:rPr>
+          <w:b/>
+          <w:bCs/>
+        </w:rPr>
+      </w:pPr>
+    </w:p>
+    <w:p>
+      <w:pPr>
+        <w:rPr>
+          <w:b/>
+          <w:bCs/>
+        </w:rPr>
+      </w:pPr>
+      <w:r>
+        <w:rPr>
+          <w:b/>
+          <w:bCs/>
+        </w:rPr>
+        <w:t>### 1. Controller</w:t>
+      </w:r>
+    </w:p>
+    <w:p>
+      <w:pPr>
+        <w:rPr>
+          <w:b/>
+          <w:bCs/>
+        </w:rPr>
+      </w:pPr>
+      <w:r>
+        <w:rPr>
+          <w:b/>
+          <w:bCs/>
+        </w:rPr>
+        <w:t>**Source**: `com.beshoy.tictactoe.controller.GameApiController.java`, `com.beshoy.tictactoe.websocket.GameWebSocketHandler.java`</w:t>
+      </w:r>
+    </w:p>
+    <w:p>
+      <w:pPr>
+        <w:rPr>
+          <w:b/>
+          <w:bCs/>
+        </w:rPr>
+      </w:pPr>
+    </w:p>
+    <w:p>
+      <w:pPr>
+        <w:rPr>
+          <w:b/>
+          <w:bCs/>
+        </w:rPr>
+      </w:pPr>
+      <w:r>
+        <w:rPr>
+          <w:b/>
+          <w:bCs/>
+        </w:rPr>
+        <w:t>**Description**: These classes handle system events (HTTP requests and WebSocket messages) and delegate work to domain objects, following the Controller pattern. They act as the entry point for all client interactions.</w:t>
+      </w:r>
+    </w:p>
+    <w:p>
+      <w:pPr>
+        <w:rPr>
+          <w:b/>
+          <w:bCs/>
+        </w:rPr>
+      </w:pPr>
+    </w:p>
+    <w:p>
+      <w:pPr>
+        <w:rPr>
+          <w:b/>
+          <w:bCs/>
+        </w:rPr>
+      </w:pPr>
+      <w:r>
+        <w:rPr>
+          <w:b/>
+          <w:bCs/>
+        </w:rPr>
+        <w:t>---</w:t>
+      </w:r>
+    </w:p>
+    <w:p>
+      <w:pPr>
+        <w:rPr>
+          <w:b/>
+          <w:bCs/>
+        </w:rPr>
+      </w:pPr>
+    </w:p>
+    <w:p>
+      <w:pPr>
+        <w:rPr>
+          <w:b/>
+          <w:bCs/>
+        </w:rPr>
+      </w:pPr>
+      <w:r>
+        <w:rPr>
+          <w:b/>
+          <w:bCs/>
+        </w:rPr>
+        <w:t>### 2. Information Expert</w:t>
+      </w:r>
+    </w:p>
+    <w:p>
+      <w:pPr>
+        <w:rPr>
+          <w:b/>
+          <w:bCs/>
+        </w:rPr>
+      </w:pPr>
+      <w:r>
+        <w:rPr>
+          <w:b/>
+          <w:bCs/>
+        </w:rPr>
+        <w:t>**Source**: `com.beshoy.tictactoe.model.GameBoard.java`</w:t>
+      </w:r>
+    </w:p>
+    <w:p>
+      <w:pPr>
+        <w:rPr>
+          <w:b/>
+          <w:bCs/>
+        </w:rPr>
+      </w:pPr>
+    </w:p>
+    <w:p>
+      <w:pPr>
+        <w:rPr>
+          <w:b/>
+          <w:bCs/>
+        </w:rPr>
+      </w:pPr>
+      <w:r>
+        <w:rPr>
+          <w:b/>
+          <w:bCs/>
+        </w:rPr>
+        <w:t>**Description**: `</w:t>
+      </w:r>
+      <w:proofErr w:type="spellStart"/>
+      <w:r>
+        <w:rPr>
+          <w:b/>
+          <w:bCs/>
+        </w:rPr>
+        <w:t>GameBoard</w:t>
+      </w:r>
+      <w:proofErr w:type="spellEnd"/>
+      <w:r>
+        <w:rPr>
+          <w:b/>
+          <w:bCs/>
+        </w:rPr>
+        <w:t>` is the information expert for board-related operations:</w:t>
+      </w:r>
+    </w:p>
+    <w:p>
+      <w:pPr>
+        <w:rPr>
+          <w:b/>
+          <w:bCs/>
+        </w:rPr>
+      </w:pPr>
+      <w:r>
+        <w:rPr>
+          <w:b/>
+          <w:bCs/>
+        </w:rPr>
+        <w:t>- Placing symbols (`</w:t>
+      </w:r>
+      <w:proofErr w:type="spellStart"/>
+      <w:r>
+        <w:rPr>
+          <w:b/>
+          <w:bCs/>
+        </w:rPr>
+        <w:t>placeSymbol</w:t>
+      </w:r>
+      <w:proofErr w:type="spellEnd"/>
+      <w:r>
+        <w:rPr>
+          <w:b/>
+          <w:bCs/>
+        </w:rPr>
+        <w:t>`)</w:t>
+      </w:r>
+    </w:p>
+    <w:p>
+      <w:pPr>
+        <w:rPr>
+          <w:b/>
+          <w:bCs/>
+        </w:rPr>
+      </w:pPr>
+      <w:r>
+        <w:rPr>
+          <w:b/>
+          <w:bCs/>
+        </w:rPr>
+        <w:t>- Checking for winners (`</w:t>
+      </w:r>
+      <w:proofErr w:type="spellStart"/>
+      <w:r>
+        <w:rPr>
+          <w:b/>
+          <w:bCs/>
+        </w:rPr>
+        <w:t>checkWinner</w:t>
+      </w:r>
+      <w:proofErr w:type="spellEnd"/>
+      <w:r>
+        <w:rPr>
+          <w:b/>
+          <w:bCs/>
+        </w:rPr>
+        <w:t>`)</w:t>
+      </w:r>
+    </w:p>
+    <w:p>
+      <w:pPr>
+        <w:rPr>
+          <w:b/>
+          <w:bCs/>
+        </w:rPr>
+      </w:pPr>
+      <w:r>
+        <w:rPr>
+          <w:b/>
+          <w:bCs/>
+        </w:rPr>
+        <w:t>- Checking if board is full (`</w:t>
+      </w:r>
+      <w:proofErr w:type="spellStart"/>
+      <w:r>
+        <w:rPr>
+          <w:b/>
+          <w:bCs/>
+        </w:rPr>
+        <w:t>isFull</w:t>
+      </w:r>
+      <w:proofErr w:type="spellEnd"/>
+      <w:r>
+        <w:rPr>
+          <w:b/>
+          <w:bCs/>
+        </w:rPr>
+        <w:t>`)</w:t>
+      </w:r>
+    </w:p>
+    <w:p>
+      <w:pPr>
+        <w:rPr>
+          <w:b/>
+          <w:bCs/>
+        </w:rPr>
+      </w:pPr>
+      <w:r>
+        <w:rPr>
+          <w:b/>
+          <w:bCs/>
+        </w:rPr>
+        <w:t>- Checking if a position is empty (`</w:t>
+      </w:r>
+      <w:proofErr w:type="spellStart"/>
+      <w:r>
+        <w:rPr>
+          <w:b/>
+          <w:bCs/>
+        </w:rPr>
+        <w:t>isEmpty</w:t>
+      </w:r>
+      <w:proofErr w:type="spellEnd"/>
+      <w:r>
+        <w:rPr>
+          <w:b/>
+          <w:bCs/>
+        </w:rPr>
+        <w:t>`)</w:t>
+      </w:r>
+    </w:p>
+    <w:p>
+      <w:pPr>
+        <w:rPr>
+          <w:b/>
+          <w:bCs/>
+        </w:rPr>
+      </w:pPr>
+      <w:r>
+        <w:rPr>
+          <w:b/>
+          <w:bCs/>
+        </w:rPr>
+        <w:t>It has all the information needed to perform these operations, following the Information Expert principle.</w:t>
+      </w:r>
+    </w:p>
+    <w:p>
+      <w:pPr>
+        <w:rPr>
+          <w:b/>
+          <w:bCs/>
+        </w:rPr>
+      </w:pPr>
+    </w:p>
+    <w:p>
+      <w:pPr>
+        <w:rPr>
+          <w:b/>
+          <w:bCs/>
+        </w:rPr>
+      </w:pPr>
+      <w:r>
+        <w:rPr>
+          <w:b/>
+          <w:bCs/>
+        </w:rPr>
+        <w:t>---</w:t>
+      </w:r>
+    </w:p>
+    <w:p>
+      <w:pPr>
+        <w:rPr>
+          <w:b/>
+          <w:bCs/>
+        </w:rPr>
+      </w:pPr>
+    </w:p>
+    <w:p>
+      <w:pPr>
+        <w:rPr>
+          <w:b/>
+          <w:bCs/>
+        </w:rPr>
+      </w:pPr>
+      <w:r>
+        <w:rPr>
+          <w:b/>
+          <w:bCs/>
+        </w:rPr>
+        <w:t>### 3. Creator</w:t>
+      </w:r>
+    </w:p>
+    <w:p>
+      <w:pPr>
+        <w:rPr>
+          <w:b/>
+          <w:bCs/>
+        </w:rPr>
+      </w:pPr>
+      <w:r>
+        <w:rPr>
+          <w:b/>
+          <w:bCs/>
+        </w:rPr>
+        <w:lastRenderedPageBreak/>
+        <w:t>**Source**: `com.beshoy.tictactoe.service.GameSessionManager.java`</w:t>
+      </w:r>
+    </w:p>
+    <w:p>
+      <w:pPr>
+        <w:rPr>
+          <w:b/>
+          <w:bCs/>
+        </w:rPr>
+      </w:pPr>
+    </w:p>
+    <w:p>
+      <w:pPr>
+        <w:rPr>
+          <w:b/>
+          <w:bCs/>
+        </w:rPr>
+      </w:pPr>
+      <w:r>
+        <w:rPr>
+          <w:b/>
+          <w:bCs/>
+        </w:rPr>
+        <w:t>**Description**: `</w:t>
+      </w:r>
+      <w:proofErr w:type="spellStart"/>
+      <w:r>
+        <w:rPr>
+          <w:b/>
+          <w:bCs/>
+        </w:rPr>
+        <w:t>GameSessionManager</w:t>
+      </w:r>
+      <w:proofErr w:type="spellEnd"/>
+      <w:r>
+        <w:rPr>
+          <w:b/>
+          <w:bCs/>
+        </w:rPr>
+        <w:t>` is responsible for creating new `</w:t>
+      </w:r>
+      <w:proofErr w:type="spellStart"/>
+      <w:r>
+        <w:rPr>
+          <w:b/>
+          <w:bCs/>
+        </w:rPr>
+        <w:t>GameSession</w:t>
+      </w:r>
+      <w:proofErr w:type="spellEnd"/>
+      <w:r>
+        <w:rPr>
+          <w:b/>
+          <w:bCs/>
+        </w:rPr>
+        <w:t>` instances, following the Creator pattern. It has the information needed to create sessions and manages their lifecycle.</w:t>
+      </w:r>
+    </w:p>
+    <w:p>
+      <w:pPr>
+        <w:rPr>
+          <w:b/>
+          <w:bCs/>
+        </w:rPr>
+      </w:pPr>
+    </w:p>
+    <w:p>
+      <w:pPr>
+        <w:rPr>
+          <w:b/>
+          <w:bCs/>
+        </w:rPr>
+      </w:pPr>
+      <w:r>
+        <w:rPr>
+          <w:b/>
+          <w:bCs/>
+        </w:rPr>
+        <w:t>---</w:t>
+      </w:r>
+    </w:p>
+    <w:p>
+      <w:pPr>
+        <w:rPr>
+          <w:b/>
+          <w:bCs/>
+        </w:rPr>
+      </w:pPr>
+    </w:p>
+    <w:p>
+      <w:pPr>
+        <w:rPr>
+          <w:b/>
+          <w:bCs/>
+        </w:rPr>
+      </w:pPr>
+      <w:r>
+        <w:rPr>
+          <w:b/>
+          <w:bCs/>
+        </w:rPr>
+        <w:t>### 4. Low Coupling</w:t>
+      </w:r>
+    </w:p>
+    <w:p>
+      <w:pPr>
+        <w:rPr>
+          <w:b/>
+          <w:bCs/>
+        </w:rPr>
+      </w:pPr>
+      <w:r>
+        <w:rPr>
+          <w:b/>
+          <w:bCs/>
+        </w:rPr>
+        <w:t>**Source**: All classes across the application</w:t>
+      </w:r>
+    </w:p>
+    <w:p>
+      <w:pPr>
+        <w:rPr>
+          <w:b/>
+          <w:bCs/>
+        </w:rPr>
+      </w:pPr>
+    </w:p>
+    <w:p>
+      <w:pPr>
+        <w:rPr>
+          <w:b/>
+          <w:bCs/>
+        </w:rPr>
+      </w:pPr>
+      <w:r>
+        <w:rPr>
+          <w:b/>
+          <w:bCs/>
+        </w:rPr>
+        <w:t>**Description**: Classes are designed with low coupling:</w:t>
+      </w:r>
+    </w:p>
+    <w:p>
+      <w:pPr>
+        <w:rPr>
+          <w:b/>
+          <w:bCs/>
+        </w:rPr>
+      </w:pPr>
+      <w:r>
+        <w:rPr>
+          <w:b/>
+          <w:bCs/>
+        </w:rPr>
+        <w:t>- Controllers depend on services, not directly on models</w:t>
+      </w:r>
+    </w:p>
+    <w:p>
+      <w:pPr>
+        <w:rPr>
+          <w:b/>
+          <w:bCs/>
+        </w:rPr>
+      </w:pPr>
+      <w:r>
+        <w:rPr>
+          <w:b/>
+          <w:bCs/>
+        </w:rPr>
+        <w:t>- Services depend on models through interfaces</w:t>
+      </w:r>
+    </w:p>
+    <w:p>
+      <w:pPr>
+        <w:rPr>
+          <w:b/>
+          <w:bCs/>
+        </w:rPr>
+      </w:pPr>
+      <w:r>
+        <w:rPr>
+          <w:b/>
+          <w:bCs/>
+        </w:rPr>
+        <w:t>- WebSocket handler depends on service layer</w:t>
+      </w:r>
+    </w:p>
+    <w:p>
+      <w:pPr>
+        <w:rPr>
+          <w:b/>
+          <w:bCs/>
+        </w:rPr>
+      </w:pPr>
+      <w:r>
+        <w:rPr>
+          <w:b/>
+          <w:bCs/>
+        </w:rPr>
+        <w:t>- This makes the system more maintainable and testable</w:t>
+      </w:r>
+    </w:p>
+    <w:p>
+      <w:pPr>
+        <w:rPr>
+          <w:b/>
+          <w:bCs/>
+        </w:rPr>
+      </w:pPr>
+    </w:p>
+    <w:p>
+      <w:pPr>
+        <w:rPr>
+          <w:b/>
+          <w:bCs/>
+        </w:rPr>
+      </w:pPr>
+      <w:r>
+        <w:rPr>
+          <w:b/>
+          <w:bCs/>
+        </w:rPr>
+        <w:t>---</w:t>
+      </w:r>
+    </w:p>
+    <w:p>
+      <w:pPr>
+        <w:rPr>
+          <w:b/>
+          <w:bCs/>
+        </w:rPr>
+      </w:pPr>
+    </w:p>
+    <w:p>
+      <w:pPr>
+        <w:rPr>
+          <w:b/>
+          <w:bCs/>
+        </w:rPr>
+      </w:pPr>
+      <w:r>
+        <w:rPr>
+          <w:b/>
+          <w:bCs/>
+        </w:rPr>
+        <w:t>### 5. High Cohesion</w:t>
+      </w:r>
+    </w:p>
+    <w:p>
+      <w:pPr>
+        <w:rPr>
+          <w:b/>
+          <w:bCs/>
+        </w:rPr>
+      </w:pPr>
+      <w:r>
+        <w:rPr>
+          <w:b/>
+          <w:bCs/>
+        </w:rPr>
+        <w:t xml:space="preserve">**Source**: </w:t>
+      </w:r>
+    </w:p>
+    <w:p>
+      <w:pPr>
+        <w:rPr>
+          <w:b/>
+          <w:bCs/>
+        </w:rPr>
+      </w:pPr>
+      <w:r>
+        <w:rPr>
+          <w:b/>
+          <w:bCs/>
+        </w:rPr>
+        <w:t>- `com.beshoy.tictactoe.model.GameBoard.java`</w:t>
+      </w:r>
+    </w:p>
+    <w:p>
+      <w:pPr>
+        <w:rPr>
+          <w:b/>
+          <w:bCs/>
+        </w:rPr>
+      </w:pPr>
+      <w:r>
+        <w:rPr>
+          <w:b/>
+          <w:bCs/>
+        </w:rPr>
+        <w:t>- `com.beshoy.tictactoe.service.GameSession.java`</w:t>
+      </w:r>
+    </w:p>
+    <w:p>
+      <w:pPr>
+        <w:rPr>
+          <w:b/>
+          <w:bCs/>
+        </w:rPr>
+      </w:pPr>
+      <w:r>
+        <w:rPr>
+          <w:b/>
+          <w:bCs/>
+        </w:rPr>
+        <w:t>- `com.beshoy.tictactoe.websocket.GameWebSocketHandler.java`</w:t>
+      </w:r>
+    </w:p>
+    <w:p>
+      <w:pPr>
+        <w:rPr>
+          <w:b/>
+          <w:bCs/>
+        </w:rPr>
+      </w:pPr>
+    </w:p>
+    <w:p>
+      <w:pPr>
+        <w:rPr>
+          <w:b/>
+          <w:bCs/>
+        </w:rPr>
+      </w:pPr>
+      <w:r>
+        <w:rPr>
+          <w:b/>
+          <w:bCs/>
+        </w:rPr>
+        <w:t>**Description**: Each class has a single, well-defined responsibility:</w:t>
+      </w:r>
+    </w:p>
+    <w:p>
+      <w:pPr>
+        <w:rPr>
+          <w:b/>
+          <w:bCs/>
+        </w:rPr>
+      </w:pPr>
+      <w:r>
+        <w:rPr>
+          <w:b/>
+          <w:bCs/>
+        </w:rPr>
+        <w:t>- `</w:t>
+      </w:r>
+      <w:proofErr w:type="spellStart"/>
+      <w:r>
+        <w:rPr>
+          <w:b/>
+          <w:bCs/>
+        </w:rPr>
+        <w:t>GameBoard</w:t>
+      </w:r>
+      <w:proofErr w:type="spellEnd"/>
+      <w:r>
+        <w:rPr>
+          <w:b/>
+          <w:bCs/>
+        </w:rPr>
+        <w:t>`: Manages the board state and board operations</w:t>
+      </w:r>
+    </w:p>
+    <w:p>
+      <w:pPr>
+        <w:rPr>
+          <w:b/>
+          <w:bCs/>
+        </w:rPr>
+      </w:pPr>
+      <w:r>
+        <w:rPr>
+          <w:b/>
+          <w:bCs/>
+        </w:rPr>
+        <w:t>- `</w:t>
+      </w:r>
+      <w:proofErr w:type="spellStart"/>
+      <w:r>
+        <w:rPr>
+          <w:b/>
+          <w:bCs/>
+        </w:rPr>
+        <w:t>GameSession</w:t>
+      </w:r>
+      <w:proofErr w:type="spellEnd"/>
+      <w:r>
+        <w:rPr>
+          <w:b/>
+          <w:bCs/>
+        </w:rPr>
+        <w:t>`: Manages game flow, players, and turn logic</w:t>
+      </w:r>
+    </w:p>
+    <w:p>
+      <w:pPr>
+        <w:rPr>
+          <w:b/>
+          <w:bCs/>
+        </w:rPr>
+      </w:pPr>
+      <w:r>
+        <w:rPr>
+          <w:b/>
+          <w:bCs/>
+        </w:rPr>
+        <w:t>- `</w:t>
+      </w:r>
+      <w:proofErr w:type="spellStart"/>
+      <w:r>
+        <w:rPr>
+          <w:b/>
+          <w:bCs/>
+        </w:rPr>
+        <w:t>GameSessionManager</w:t>
+      </w:r>
+      <w:proofErr w:type="spellEnd"/>
+      <w:r>
+        <w:rPr>
+          <w:b/>
+          <w:bCs/>
+        </w:rPr>
+        <w:t>`: Manages multiple game sessions</w:t>
+      </w:r>
+    </w:p>
+    <w:p>
+      <w:pPr>
+        <w:rPr>
+          <w:b/>
+          <w:bCs/>
+        </w:rPr>
+      </w:pPr>
+      <w:r>
+        <w:rPr>
+          <w:b/>
+          <w:bCs/>
+        </w:rPr>
+        <w:t>- `</w:t>
+      </w:r>
+      <w:proofErr w:type="spellStart"/>
+      <w:r>
+        <w:rPr>
+          <w:b/>
+          <w:bCs/>
+        </w:rPr>
+        <w:t>GameWebSocketHandler</w:t>
+      </w:r>
+      <w:proofErr w:type="spellEnd"/>
+      <w:r>
+        <w:rPr>
+          <w:b/>
+          <w:bCs/>
+        </w:rPr>
+        <w:t>`: Manages WebSocket communication</w:t>
+      </w:r>
+    </w:p>
+    <w:p>
+      <w:pPr>
+        <w:rPr>
+          <w:b/>
+          <w:bCs/>
+        </w:rPr>
+      </w:pPr>
+      <w:r>
+        <w:rPr>
+          <w:b/>
+          <w:bCs/>
+        </w:rPr>
+        <w:t>- `</w:t>
+      </w:r>
+      <w:proofErr w:type="spellStart"/>
+      <w:r>
+        <w:rPr>
+          <w:b/>
+          <w:bCs/>
+        </w:rPr>
+        <w:t>GameApiController</w:t>
+      </w:r>
+      <w:proofErr w:type="spellEnd"/>
+      <w:r>
+        <w:rPr>
+          <w:b/>
+          <w:bCs/>
+        </w:rPr>
+        <w:t>`: Handles REST API requests</w:t>
+      </w:r>
+    </w:p>
+    <w:p>
+      <w:pPr>
+        <w:rPr>
+          <w:b/>
+          <w:bCs/>
+        </w:rPr>
+      </w:pPr>
+      <w:r>
+        <w:rPr>
+          <w:b/>
+          <w:bCs/>
+        </w:rPr>
+        <w:t>This ensures high cohesion within each class.</w:t>
+      </w:r>
+    </w:p>
+    <w:p>
+      <w:pPr>
+        <w:rPr>
+          <w:b/>
+          <w:bCs/>
+        </w:rPr>
+      </w:pPr>
+      <w:r>
+        <w:rPr>
+          <w:b/>
+          <w:bCs/>
+        </w:rPr>
+        <w:lastRenderedPageBreak/>
+        <w:t>## SOLID Principles Applied</w:t>
+      </w:r>
+    </w:p>
+    <w:p>
+      <w:pPr>
+        <w:rPr>
+          <w:b/>
+          <w:bCs/>
+        </w:rPr>
+      </w:pPr>
+    </w:p>
+    <w:p>
+      <w:pPr>
+        <w:rPr>
+          <w:b/>
+          <w:bCs/>
+        </w:rPr>
+      </w:pPr>
+      <w:r>
+        <w:rPr>
+          <w:b/>
+          <w:bCs/>
+        </w:rPr>
+        <w:t>### 1. Single Responsibility Principle (SRP)</w:t>
+      </w:r>
+    </w:p>
+    <w:p>
+      <w:pPr>
+        <w:rPr>
+          <w:b/>
+          <w:bCs/>
+        </w:rPr>
+      </w:pPr>
+      <w:r>
+        <w:rPr>
+          <w:b/>
+          <w:bCs/>
+        </w:rPr>
+        <w:t xml:space="preserve">**Source**: </w:t>
+      </w:r>
+    </w:p>
+    <w:p>
+      <w:pPr>
+        <w:rPr>
+          <w:b/>
+          <w:bCs/>
+        </w:rPr>
+      </w:pPr>
+      <w:r>
+        <w:rPr>
+          <w:b/>
+          <w:bCs/>
+        </w:rPr>
+        <w:t>- `com.beshoy.tictactoe.model.GameBoard.java` - Only handles board operations</w:t>
+      </w:r>
+    </w:p>
+    <w:p>
+      <w:pPr>
+        <w:rPr>
+          <w:b/>
+          <w:bCs/>
+        </w:rPr>
+      </w:pPr>
+      <w:r>
+        <w:rPr>
+          <w:b/>
+          <w:bCs/>
+        </w:rPr>
+        <w:t>- `com.beshoy.tictactoe.service.GameSession.java` - Only handles game logic</w:t>
+      </w:r>
+    </w:p>
+    <w:p>
+      <w:pPr>
+        <w:rPr>
+          <w:b/>
+          <w:bCs/>
+        </w:rPr>
+      </w:pPr>
+      <w:r>
+        <w:rPr>
+          <w:b/>
+          <w:bCs/>
+        </w:rPr>
+        <w:t>- `com.beshoy.tictactoe.websocket.GameWebSocketHandler.java` - Only handles WebSocket communication</w:t>
+      </w:r>
+    </w:p>
+    <w:p>
+      <w:pPr>
+        <w:rPr>
+          <w:b/>
+          <w:bCs/>
+        </w:rPr>
+      </w:pPr>
+      <w:r>
+        <w:rPr>
+          <w:b/>
+          <w:bCs/>
+        </w:rPr>
+        <w:t>- `com.beshoy.tictactoe.controller.GameApiController.java` - Only handles REST API endpoints</w:t>
+      </w:r>
+    </w:p>
+    <w:p>
+      <w:pPr>
+        <w:rPr>
+          <w:b/>
+          <w:bCs/>
+        </w:rPr>
+      </w:pPr>
+    </w:p>
+    <w:p>
+      <w:pPr>
+        <w:rPr>
+          <w:b/>
+          <w:bCs/>
+        </w:rPr>
+      </w:pPr>
+      <w:r>
+        <w:rPr>
+          <w:b/>
+          <w:bCs/>
+        </w:rPr>
+        <w:t>**Description**: Each class has exactly one reason to change, following the Single Responsibility Principle. The responsibilities are clearly separated across different classes.</w:t>
+      </w:r>
+    </w:p>
+    <w:p>
+      <w:pPr>
+        <w:rPr>
+          <w:b/>
+          <w:bCs/>
+        </w:rPr>
+      </w:pPr>
+    </w:p>
+    <w:p>
+      <w:pPr>
+        <w:rPr>
+          <w:b/>
+          <w:bCs/>
+        </w:rPr>
+      </w:pPr>
+    </w:p>
+    <w:p>
+      <w:pPr>
+        <w:rPr>
+          <w:b/>
+          <w:bCs/>
+        </w:rPr>
+      </w:pPr>
+      <w:r>
+        <w:rPr>
+          <w:b/>
+          <w:bCs/>
+        </w:rPr>
+        <w:t>### 2. Open/Closed Principle</w:t>
+      </w:r>
+    </w:p>
+    <w:p>
+      <w:pPr>
+        <w:rPr>
+          <w:b/>
+          <w:bCs/>
+        </w:rPr>
+      </w:pPr>
+      <w:r>
+        <w:rPr>
+          <w:b/>
+          <w:bCs/>
+        </w:rPr>
+        <w:t>**Source**: `com.beshoy.tictactoe.model.GameBoard.java`</w:t>
+      </w:r>
+    </w:p>
+    <w:p>
+      <w:pPr>
+        <w:rPr>
+          <w:b/>
+          <w:bCs/>
+        </w:rPr>
+      </w:pPr>
+    </w:p>
+    <w:p>
+      <w:pPr>
+        <w:rPr>
+          <w:b/>
+          <w:bCs/>
+        </w:rPr>
+      </w:pPr>
+      <w:r>
+        <w:rPr>
+          <w:b/>
+          <w:bCs/>
+        </w:rPr>
+        <w:t>**Description**: The `</w:t>
+      </w:r>
+      <w:proofErr w:type="spellStart"/>
+      <w:r>
+        <w:rPr>
+          <w:b/>
+          <w:bCs/>
+        </w:rPr>
+        <w:t>checkWinner</w:t>
+      </w:r>
+      <w:proofErr w:type="spellEnd"/>
+      <w:r>
+        <w:rPr>
+          <w:b/>
+          <w:bCs/>
+        </w:rPr>
+        <w:t>` method is open for extension but closed for modification. New winning strategies can be added without modifying the existing code. The board can be extended with new features without changing existing functionality.</w:t>
+      </w:r>
+    </w:p>
+    <w:p>
+      <w:pPr>
+        <w:rPr>
+          <w:b/>
+          <w:bCs/>
+        </w:rPr>
+      </w:pPr>
+    </w:p>
+    <w:p>
+      <w:pPr>
+        <w:rPr>
+          <w:b/>
+          <w:bCs/>
+        </w:rPr>
+      </w:pPr>
+      <w:r>
+        <w:rPr>
+          <w:b/>
+          <w:bCs/>
+        </w:rPr>
+        <w:t xml:space="preserve">### 3. </w:t>
+      </w:r>
+      <w:proofErr w:type="spellStart"/>
+      <w:r>
+        <w:rPr>
+          <w:b/>
+          <w:bCs/>
+        </w:rPr>
+        <w:t>Liskov</w:t>
+      </w:r>
+      <w:proofErr w:type="spellEnd"/>
+      <w:r>
+        <w:rPr>
+          <w:b/>
+          <w:bCs/>
+        </w:rPr>
+        <w:t xml:space="preserve"> Substitution Principle</w:t>
+      </w:r>
+    </w:p>
+    <w:p>
+      <w:pPr>
+        <w:rPr>
+          <w:b/>
+          <w:bCs/>
+        </w:rPr>
+      </w:pPr>
+      <w:r>
+        <w:rPr>
+          <w:b/>
+          <w:bCs/>
+        </w:rPr>
+        <w:t>**Source**: All classes using standard Java and Spring interfaces</w:t>
+      </w:r>
+    </w:p>
+    <w:p>
+      <w:pPr>
+        <w:rPr>
+          <w:b/>
+          <w:bCs/>
+        </w:rPr>
+      </w:pPr>
+    </w:p>
+    <w:p>
+      <w:pPr>
+        <w:rPr>
+          <w:b/>
+          <w:bCs/>
+        </w:rPr>
+      </w:pPr>
+      <w:r>
+        <w:rPr>
+          <w:b/>
+          <w:bCs/>
+        </w:rPr>
+        <w:t>**Description**: The application uses standard Java interfaces and Spring annotations. All subclasses can be substituted for their base classes without affecting the correctness of the program:</w:t>
+      </w:r>
+    </w:p>
+    <w:p>
+      <w:pPr>
+        <w:rPr>
+          <w:b/>
+          <w:bCs/>
+        </w:rPr>
+      </w:pPr>
+      <w:r>
+        <w:rPr>
+          <w:b/>
+          <w:bCs/>
+        </w:rPr>
+        <w:t>- `</w:t>
+      </w:r>
+      <w:proofErr w:type="spellStart"/>
+      <w:r>
+        <w:rPr>
+          <w:b/>
+          <w:bCs/>
+        </w:rPr>
+        <w:t>GameWebSocketHandler</w:t>
+      </w:r>
+      <w:proofErr w:type="spellEnd"/>
+      <w:r>
+        <w:rPr>
+          <w:b/>
+          <w:bCs/>
+        </w:rPr>
+        <w:t>` extends `</w:t>
+      </w:r>
+      <w:proofErr w:type="spellStart"/>
+      <w:r>
+        <w:rPr>
+          <w:b/>
+          <w:bCs/>
+        </w:rPr>
+        <w:t>TextWebSocketHandler</w:t>
+      </w:r>
+      <w:proofErr w:type="spellEnd"/>
+      <w:r>
+        <w:rPr>
+          <w:b/>
+          <w:bCs/>
+        </w:rPr>
+        <w:t>`</w:t>
+      </w:r>
+    </w:p>
+    <w:p>
+      <w:pPr>
+        <w:rPr>
+          <w:b/>
+          <w:bCs/>
+        </w:rPr>
+      </w:pPr>
+      <w:r>
+        <w:rPr>
+          <w:b/>
+          <w:bCs/>
+        </w:rPr>
+        <w:t>- All Spring components follow standard interfaces</w:t>
+      </w:r>
+    </w:p>
+    <w:p>
+      <w:pPr>
+        <w:rPr>
+          <w:b/>
+          <w:bCs/>
+        </w:rPr>
+      </w:pPr>
+    </w:p>
+    <w:p>
+      <w:pPr>
+        <w:rPr>
+          <w:b/>
+          <w:bCs/>
+        </w:rPr>
+      </w:pPr>
+      <w:r>
+        <w:rPr>
+          <w:b/>
+          <w:bCs/>
+        </w:rPr>
+        <w:t>### 4. Interface Segregation Principle</w:t>
+      </w:r>
+    </w:p>
+    <w:p>
+      <w:pPr>
+        <w:rPr>
+          <w:b/>
+          <w:bCs/>
+        </w:rPr>
+      </w:pPr>
+      <w:r>
+        <w:rPr>
+          <w:b/>
+          <w:bCs/>
+        </w:rPr>
+        <w:t>**Source**: Spring framework interfaces used in the application</w:t>
+      </w:r>
+    </w:p>
+    <w:p>
+      <w:pPr>
+        <w:rPr>
+          <w:b/>
+          <w:bCs/>
+        </w:rPr>
+      </w:pPr>
+    </w:p>
+    <w:p>
+      <w:pPr>
+        <w:rPr>
+          <w:b/>
+          <w:bCs/>
+        </w:rPr>
+      </w:pPr>
+      <w:r>
+        <w:rPr>
+          <w:b/>
+          <w:bCs/>
+        </w:rPr>
+        <w:lastRenderedPageBreak/>
+        <w:t>**Description**: The application uses specific Spring interfaces that are focused and not bloated:</w:t>
+      </w:r>
+    </w:p>
+    <w:p>
+      <w:pPr>
+        <w:rPr>
+          <w:b/>
+          <w:bCs/>
+        </w:rPr>
+      </w:pPr>
+      <w:r>
+        <w:rPr>
+          <w:b/>
+          <w:bCs/>
+        </w:rPr>
+        <w:t>- `</w:t>
+      </w:r>
+      <w:proofErr w:type="spellStart"/>
+      <w:r>
+        <w:rPr>
+          <w:b/>
+          <w:bCs/>
+        </w:rPr>
+        <w:t>WebSocketHandler</w:t>
+      </w:r>
+      <w:proofErr w:type="spellEnd"/>
+      <w:r>
+        <w:rPr>
+          <w:b/>
+          <w:bCs/>
+        </w:rPr>
+        <w:t>` - focused on WebSocket message handling</w:t>
+      </w:r>
+    </w:p>
+    <w:p>
+      <w:pPr>
+        <w:rPr>
+          <w:b/>
+          <w:bCs/>
+        </w:rPr>
+      </w:pPr>
+      <w:r>
+        <w:rPr>
+          <w:b/>
+          <w:bCs/>
+        </w:rPr>
+        <w:t>- `</w:t>
+      </w:r>
+      <w:proofErr w:type="spellStart"/>
+      <w:r>
+        <w:rPr>
+          <w:b/>
+          <w:bCs/>
+        </w:rPr>
+        <w:t>WebSocketConfigurer</w:t>
+      </w:r>
+      <w:proofErr w:type="spellEnd"/>
+      <w:r>
+        <w:rPr>
+          <w:b/>
+          <w:bCs/>
+        </w:rPr>
+        <w:t>` - focused on WebSocket configuration</w:t>
+      </w:r>
+    </w:p>
+    <w:p>
+      <w:pPr>
+        <w:rPr>
+          <w:b/>
+          <w:bCs/>
+        </w:rPr>
+      </w:pPr>
+      <w:r>
+        <w:rPr>
+          <w:b/>
+          <w:bCs/>
+        </w:rPr>
+        <w:t>- `@Service`, `@Component`, `@RestController` - specific Spring stereotypes</w:t>
+      </w:r>
+    </w:p>
+    <w:p>
+      <w:pPr>
+        <w:rPr>
+          <w:b/>
+          <w:bCs/>
+        </w:rPr>
+      </w:pPr>
+      <w:r>
+        <w:rPr>
+          <w:b/>
+          <w:bCs/>
+        </w:rPr>
+        <w:t>No class is forced to implement methods it doesn't need.</w:t>
+      </w:r>
+    </w:p>
+    <w:p>
+      <w:pPr>
+        <w:rPr>
+          <w:b/>
+          <w:bCs/>
+        </w:rPr>
+      </w:pPr>
+    </w:p>
+    <w:p>
+      <w:pPr>
+        <w:rPr>
+          <w:b/>
+          <w:bCs/>
+        </w:rPr>
+      </w:pPr>
+      <w:r>
+        <w:rPr>
+          <w:b/>
+          <w:bCs/>
+        </w:rPr>
+        <w:t>### 5. Dependency Inversion Principle</w:t>
+      </w:r>
+    </w:p>
+    <w:p>
+      <w:pPr>
+        <w:rPr>
+          <w:b/>
+          <w:bCs/>
+        </w:rPr>
+      </w:pPr>
+      <w:r>
+        <w:rPr>
+          <w:b/>
+          <w:bCs/>
+        </w:rPr>
+        <w:t xml:space="preserve">**Source**: </w:t>
+      </w:r>
+    </w:p>
+    <w:p>
+      <w:pPr>
+        <w:rPr>
+          <w:b/>
+          <w:bCs/>
+        </w:rPr>
+      </w:pPr>
+      <w:r>
+        <w:rPr>
+          <w:b/>
+          <w:bCs/>
+        </w:rPr>
+        <w:t>- `com.beshoy.tictactoe.controller.GameApiController.java`</w:t>
+      </w:r>
+    </w:p>
+    <w:p>
+      <w:pPr>
+        <w:rPr>
+          <w:b/>
+          <w:bCs/>
+        </w:rPr>
+      </w:pPr>
+      <w:r>
+        <w:rPr>
+          <w:b/>
+          <w:bCs/>
+        </w:rPr>
+        <w:t>- `com.beshoy.tictactoe.websocket.GameWebSocketHandler.java`</w:t>
+      </w:r>
+    </w:p>
+    <w:p>
+      <w:pPr>
+        <w:rPr>
+          <w:b/>
+          <w:bCs/>
+        </w:rPr>
+      </w:pPr>
+    </w:p>
+    <w:p>
+      <w:pPr>
+        <w:rPr>
+          <w:b/>
+          <w:bCs/>
+        </w:rPr>
+      </w:pPr>
+      <w:r>
+        <w:rPr>
+          <w:b/>
+          <w:bCs/>
+        </w:rPr>
+        <w:t>**Description**: High-level modules depend on abstractions rather than concrete implementations:</w:t>
+      </w:r>
+    </w:p>
+    <w:p>
+      <w:pPr>
+        <w:rPr>
+          <w:b/>
+          <w:bCs/>
+        </w:rPr>
+      </w:pPr>
+      <w:r>
+        <w:rPr>
+          <w:b/>
+          <w:bCs/>
+        </w:rPr>
+        <w:t>- Controllers depend on services (through constructor injection)</w:t>
+      </w:r>
+    </w:p>
+    <w:p>
+      <w:pPr>
+        <w:rPr>
+          <w:b/>
+          <w:bCs/>
+        </w:rPr>
+      </w:pPr>
+      <w:r>
+        <w:rPr>
+          <w:b/>
+          <w:bCs/>
+        </w:rPr>
+        <w:t>- Spring manages dependency injection</w:t>
+      </w:r>
+    </w:p>
+    <w:p>
+      <w:pPr>
+        <w:rPr>
+          <w:b/>
+          <w:bCs/>
+        </w:rPr>
+      </w:pPr>
+      <w:r>
+        <w:rPr>
+          <w:b/>
+          <w:bCs/>
+        </w:rPr>
+        <w:t>- This allows for easy testing and replacement of implementations</w:t>
+      </w:r>
+    </w:p>
+    <w:p>
+      <w:pPr>
+        <w:rPr>
+          <w:b/>
+          <w:bCs/>
+        </w:rPr>
+      </w:pPr>
+    </w:p>
+    <w:p>
+      <w:pPr>
+        <w:rPr>
+          <w:b/>
+          <w:bCs/>
+        </w:rPr>
+      </w:pPr>
+      <w:r>
+        <w:rPr>
+          <w:b/>
+          <w:bCs/>
+        </w:rPr>
+        <w:t>## Testing Strategy</w:t>
+      </w:r>
+    </w:p>
+    <w:p>
+      <w:pPr>
+        <w:rPr>
+          <w:b/>
+          <w:bCs/>
+        </w:rPr>
+      </w:pPr>
+      <w:r>
+        <w:rPr>
+          <w:b/>
+          <w:bCs/>
+        </w:rPr>
+        <w:t>- **Unit Tests**: JUnit 5 for backend logic</w:t>
+      </w:r>
+    </w:p>
+    <w:p>
+      <w:pPr>
+        <w:rPr>
+          <w:b/>
+          <w:bCs/>
+        </w:rPr>
+      </w:pPr>
+      <w:r>
+        <w:rPr>
+          <w:b/>
+          <w:bCs/>
+        </w:rPr>
+        <w:t>- **Test Coverage**: Minimum 80% for core business logic (</w:t>
+      </w:r>
+      <w:proofErr w:type="spellStart"/>
+      <w:r>
+        <w:rPr>
+          <w:b/>
+          <w:bCs/>
+        </w:rPr>
+        <w:t>GameBoard</w:t>
+      </w:r>
+      <w:proofErr w:type="spellEnd"/>
+      <w:r>
+        <w:rPr>
+          <w:b/>
+          <w:bCs/>
+        </w:rPr>
         <w:t xml:space="preserve">, </w:t>
       </w:r>
-      <w:r>
-        <w:t>receive messages</w:t>
-      </w:r>
-      <w:r>
-        <w:t xml:space="preserve">, </w:t>
-      </w:r>
-      <w:r>
-        <w:t>establish connection</w:t>
-      </w:r>
-      <w:r>
-        <w:t>.</w:t>
-      </w:r>
-    </w:p>
-    <w:p>
-      <w:pPr>
-        <w:rPr>
-          <w:b/>
-          <w:bCs/>
-        </w:rPr>
-      </w:pPr>
+      <w:proofErr w:type="spellStart"/>
+      <w:r>
+        <w:rPr>
+          <w:b/>
+          <w:bCs/>
+        </w:rPr>
+        <w:t>GameSession</w:t>
+      </w:r>
+      <w:proofErr w:type="spellEnd"/>
+      <w:r>
+        <w:rPr>
+          <w:b/>
+          <w:bCs/>
+        </w:rPr>
+        <w:t>)</w:t>
+      </w:r>
+    </w:p>
+    <w:p>
+      <w:pPr>
+        <w:rPr>
+          <w:b/>
+          <w:bCs/>
+        </w:rPr>
+      </w:pPr>
+      <w:r>
+        <w:rPr>
+          <w:b/>
+          <w:bCs/>
+        </w:rPr>
+        <w:t>- **Test Types**: Unit tests for models and services</w:t>
+      </w:r>
+    </w:p>
+    <w:p>
+      <w:pPr>
+        <w:rPr>
+          <w:b/>
+          <w:bCs/>
+        </w:rPr>
+      </w:pPr>
+    </w:p>
+    <w:p>
+      <w:pPr>
+        <w:rPr>
+          <w:b/>
+          <w:bCs/>
+        </w:rPr>
+      </w:pPr>
+      <w:r>
+        <w:rPr>
+          <w:b/>
+          <w:bCs/>
+        </w:rPr>
+        <w:t>## Technology Stack</w:t>
+      </w:r>
+    </w:p>
+    <w:p>
+      <w:pPr>
+        <w:rPr>
+          <w:b/>
+          <w:bCs/>
+        </w:rPr>
+      </w:pPr>
+      <w:r>
+        <w:rPr>
+          <w:b/>
+          <w:bCs/>
+        </w:rPr>
+        <w:t>- **Backend**: Java 11, Spring Boot 2.7</w:t>
+      </w:r>
+    </w:p>
+    <w:p>
+      <w:pPr>
+        <w:rPr>
+          <w:b/>
+          <w:bCs/>
+        </w:rPr>
+      </w:pPr>
+      <w:r>
+        <w:rPr>
+          <w:b/>
+          <w:bCs/>
+        </w:rPr>
+        <w:t>- **Frontend**: HTML5, CSS3, Vanilla JavaScript</w:t>
+      </w:r>
+    </w:p>
+    <w:p>
+      <w:pPr>
+        <w:rPr>
+          <w:b/>
+          <w:bCs/>
+        </w:rPr>
+      </w:pPr>
+      <w:r>
+        <w:rPr>
+          <w:b/>
+          <w:bCs/>
+        </w:rPr>
+        <w:t>- **Communication**: REST API (HTTP), WebSocket (WS)</w:t>
+      </w:r>
+    </w:p>
+    <w:p>
+      <w:pPr>
+        <w:rPr>
+          <w:b/>
+          <w:bCs/>
+        </w:rPr>
+      </w:pPr>
+      <w:r>
+        <w:rPr>
+          <w:b/>
+          <w:bCs/>
+        </w:rPr>
+        <w:t>- **Build Tool**: Maven</w:t>
+      </w:r>
+    </w:p>
+    <w:p>
+      <w:pPr>
+        <w:rPr>
+          <w:b/>
+          <w:bCs/>
+        </w:rPr>
+      </w:pPr>
+      <w:r>
+        <w:rPr>
+          <w:b/>
+          <w:bCs/>
+        </w:rPr>
+        <w:t>- **Testing**: JUnit 5</w:t>
+      </w:r>
+    </w:p>
+    <w:p>
+      <w:pPr>
+        <w:rPr>
+          <w:b/>
+          <w:bCs/>
+        </w:rPr>
+      </w:pPr>
+    </w:p>
+    <w:p>
+      <w:pPr>
+        <w:rPr>
+          <w:b/>
+          <w:bCs/>
+        </w:rPr>
+      </w:pPr>
+      <w:r>
+        <w:rPr>
+          <w:b/>
+          <w:bCs/>
+        </w:rPr>
+        <w:t>## Deployment</w:t>
+      </w:r>
+    </w:p>
+    <w:p>
+      <w:pPr>
+        <w:rPr>
+          <w:b/>
+          <w:bCs/>
+        </w:rPr>
+      </w:pPr>
+      <w:r>
+        <w:rPr>
+          <w:b/>
+          <w:bCs/>
+        </w:rPr>
+        <w:t>- **Port**: 8080</w:t>
+      </w:r>
+    </w:p>
+    <w:p>
+      <w:pPr>
+        <w:rPr>
+          <w:b/>
+          <w:bCs/>
+        </w:rPr>
+      </w:pPr>
+      <w:r>
+        <w:rPr>
+          <w:b/>
+          <w:bCs/>
+        </w:rPr>
+        <w:lastRenderedPageBreak/>
+        <w:t>- **Protocols**: HTTP for REST endpoints, WS for WebSocket</w:t>
+      </w:r>
+    </w:p>
+    <w:p>
+      <w:pPr>
+        <w:rPr>
+          <w:b/>
+          <w:bCs/>
+        </w:rPr>
+      </w:pPr>
+      <w:r>
+        <w:rPr>
+          <w:b/>
+          <w:bCs/>
+        </w:rPr>
+        <w:t>- **CORS**: Configured for localhost development (origin: http://localhost:5173)</w:t>
+      </w:r>
+    </w:p>
+    <w:p>
+      <w:pPr>
+        <w:rPr>
+          <w:b/>
+          <w:bCs/>
+        </w:rPr>
+      </w:pPr>
+    </w:p>
+    <w:p>
+      <w:pPr>
+        <w:rPr>
+          <w:b/>
+          <w:bCs/>
+        </w:rPr>
+      </w:pPr>
+      <w:r>
+        <w:rPr>
+          <w:b/>
+          <w:bCs/>
+        </w:rPr>
+        <w:t>## System Components</w:t>
+      </w:r>
+    </w:p>
+    <w:p>
+      <w:pPr>
+        <w:rPr>
+          <w:b/>
+          <w:bCs/>
+        </w:rPr>
+      </w:pPr>
+    </w:p>
+    <w:p>
+      <w:pPr>
+        <w:rPr>
+          <w:b/>
+          <w:bCs/>
+        </w:rPr>
+      </w:pPr>
+      <w:r>
+        <w:rPr>
+          <w:b/>
+          <w:bCs/>
+        </w:rPr>
+        <w:t>### Backend Components</w:t>
+      </w:r>
+    </w:p>
+    <w:p>
+      <w:pPr>
+        <w:rPr>
+          <w:b/>
+          <w:bCs/>
+        </w:rPr>
+      </w:pPr>
+      <w:r>
+        <w:rPr>
+          <w:b/>
+          <w:bCs/>
+        </w:rPr>
+        <w:t>1. **</w:t>
+      </w:r>
+      <w:proofErr w:type="spellStart"/>
+      <w:r>
+        <w:rPr>
+          <w:b/>
+          <w:bCs/>
+        </w:rPr>
+        <w:t>GameBoard</w:t>
+      </w:r>
+      <w:proofErr w:type="spellEnd"/>
+      <w:r>
+        <w:rPr>
+          <w:b/>
+          <w:bCs/>
+        </w:rPr>
+        <w:t>**: Manages the 3x3 game board state</w:t>
+      </w:r>
+    </w:p>
+    <w:p>
+      <w:pPr>
+        <w:rPr>
+          <w:b/>
+          <w:bCs/>
+        </w:rPr>
+      </w:pPr>
+      <w:r>
+        <w:rPr>
+          <w:b/>
+          <w:bCs/>
+        </w:rPr>
+        <w:t>2. **Player**: Represents a player with name and symbol</w:t>
+      </w:r>
+    </w:p>
+    <w:p>
+      <w:pPr>
+        <w:rPr>
+          <w:b/>
+          <w:bCs/>
+        </w:rPr>
+      </w:pPr>
+      <w:r>
+        <w:rPr>
+          <w:b/>
+          <w:bCs/>
+        </w:rPr>
+        <w:t>3. **</w:t>
+      </w:r>
+      <w:proofErr w:type="spellStart"/>
+      <w:r>
+        <w:rPr>
+          <w:b/>
+          <w:bCs/>
+        </w:rPr>
+        <w:t>GameSession</w:t>
+      </w:r>
+      <w:proofErr w:type="spellEnd"/>
+      <w:r>
+        <w:rPr>
+          <w:b/>
+          <w:bCs/>
+        </w:rPr>
+        <w:t>**: Manages a single game session with two players</w:t>
+      </w:r>
+    </w:p>
+    <w:p>
+      <w:pPr>
+        <w:rPr>
+          <w:b/>
+          <w:bCs/>
+        </w:rPr>
+      </w:pPr>
+      <w:r>
+        <w:rPr>
+          <w:b/>
+          <w:bCs/>
+        </w:rPr>
+        <w:t>4. **</w:t>
+      </w:r>
+      <w:proofErr w:type="spellStart"/>
+      <w:r>
+        <w:rPr>
+          <w:b/>
+          <w:bCs/>
+        </w:rPr>
+        <w:t>GameSessionManager</w:t>
+      </w:r>
+      <w:proofErr w:type="spellEnd"/>
+      <w:r>
+        <w:rPr>
+          <w:b/>
+          <w:bCs/>
+        </w:rPr>
+        <w:t>**: Manages all active game sessions</w:t>
+      </w:r>
+    </w:p>
+    <w:p>
+      <w:pPr>
+        <w:rPr>
+          <w:b/>
+          <w:bCs/>
+        </w:rPr>
+      </w:pPr>
+      <w:r>
+        <w:rPr>
+          <w:b/>
+          <w:bCs/>
+        </w:rPr>
+        <w:t>5. **</w:t>
+      </w:r>
+      <w:proofErr w:type="spellStart"/>
+      <w:r>
+        <w:rPr>
+          <w:b/>
+          <w:bCs/>
+        </w:rPr>
+        <w:t>GameApiController</w:t>
+      </w:r>
+      <w:proofErr w:type="spellEnd"/>
+      <w:r>
+        <w:rPr>
+          <w:b/>
+          <w:bCs/>
+        </w:rPr>
+        <w:t>**: REST endpoints for creating/joining games</w:t>
+      </w:r>
+    </w:p>
+    <w:p>
+      <w:pPr>
+        <w:rPr>
+          <w:b/>
+          <w:bCs/>
+        </w:rPr>
+      </w:pPr>
+      <w:r>
+        <w:rPr>
+          <w:b/>
+          <w:bCs/>
+        </w:rPr>
+        <w:t>6. **</w:t>
+      </w:r>
+      <w:proofErr w:type="spellStart"/>
+      <w:r>
+        <w:rPr>
+          <w:b/>
+          <w:bCs/>
+        </w:rPr>
+        <w:t>GameWebSocketHandler</w:t>
+      </w:r>
+      <w:proofErr w:type="spellEnd"/>
+      <w:r>
+        <w:rPr>
+          <w:b/>
+          <w:bCs/>
+        </w:rPr>
+        <w:t>**: WebSocket handler for real-time gameplay</w:t>
+      </w:r>
+    </w:p>
+    <w:p>
+      <w:pPr>
+        <w:rPr>
+          <w:b/>
+          <w:bCs/>
+        </w:rPr>
+      </w:pPr>
+      <w:r>
+        <w:rPr>
+          <w:b/>
+          <w:bCs/>
+        </w:rPr>
+        <w:t>7. **</w:t>
+      </w:r>
+      <w:proofErr w:type="spellStart"/>
+      <w:r>
+        <w:rPr>
+          <w:b/>
+          <w:bCs/>
+        </w:rPr>
+        <w:t>WebSocketConfig</w:t>
+      </w:r>
+      <w:proofErr w:type="spellEnd"/>
+      <w:r>
+        <w:rPr>
+          <w:b/>
+          <w:bCs/>
+        </w:rPr>
+        <w:t>**: WebSocket configuration</w:t>
+      </w:r>
+    </w:p>
+    <w:p>
+      <w:pPr>
+        <w:rPr>
+          <w:b/>
+          <w:bCs/>
+        </w:rPr>
+      </w:pPr>
+    </w:p>
+    <w:p>
+      <w:pPr>
+        <w:rPr>
+          <w:b/>
+          <w:bCs/>
+        </w:rPr>
+      </w:pPr>
+      <w:r>
+        <w:rPr>
+          <w:b/>
+          <w:bCs/>
+        </w:rPr>
+        <w:t>### Frontend Components</w:t>
+      </w:r>
+    </w:p>
+    <w:p>
+      <w:pPr>
+        <w:rPr>
+          <w:b/>
+          <w:bCs/>
+        </w:rPr>
+      </w:pPr>
+      <w:r>
+        <w:rPr>
+          <w:b/>
+          <w:bCs/>
+        </w:rPr>
+        <w:t>1. **index.html**: Main page with player selection and game board</w:t>
+      </w:r>
+    </w:p>
+    <w:p>
+      <w:pPr>
+        <w:rPr>
+          <w:b/>
+          <w:bCs/>
+        </w:rPr>
+      </w:pPr>
+      <w:r>
+        <w:rPr>
+          <w:b/>
+          <w:bCs/>
+        </w:rPr>
+        <w:t>2. **style.css**: Styling for the game interface</w:t>
+      </w:r>
+    </w:p>
+    <w:p>
+      <w:pPr>
+        <w:rPr>
+          <w:b/>
+          <w:bCs/>
+        </w:rPr>
+      </w:pPr>
+      <w:r>
+        <w:rPr>
+          <w:b/>
+          <w:bCs/>
+        </w:rPr>
+        <w:t>3. **script.js**: Client-side logic for WebSocket communication and UI updates</w:t>
+      </w:r>
+    </w:p>
+    <w:p>
+      <w:pPr>
+        <w:rPr>
+          <w:b/>
+          <w:bCs/>
+        </w:rPr>
+      </w:pPr>
+    </w:p>
+    <w:p>
+      <w:pPr>
+        <w:rPr>
+          <w:b/>
+          <w:bCs/>
+        </w:rPr>
+      </w:pPr>
+      <w:r>
+        <w:rPr>
+          <w:b/>
+          <w:bCs/>
+        </w:rPr>
+        <w:t>### Communication Flow</w:t>
+      </w:r>
+    </w:p>
+    <w:p>
+      <w:pPr>
+        <w:rPr>
+          <w:b/>
+          <w:bCs/>
+        </w:rPr>
+      </w:pPr>
+      <w:r>
+        <w:rPr>
+          <w:b/>
+          <w:bCs/>
+        </w:rPr>
+        <w:t>1. Player creates game → REST API → returns session ID</w:t>
+      </w:r>
+    </w:p>
+    <w:p>
+      <w:pPr>
+        <w:rPr>
+          <w:b/>
+          <w:bCs/>
+        </w:rPr>
+      </w:pPr>
+      <w:r>
+        <w:rPr>
+          <w:b/>
+          <w:bCs/>
+        </w:rPr>
+        <w:t>2. Player joins game → REST API → returns WebSocket URL</w:t>
+      </w:r>
+    </w:p>
+    <w:p>
+      <w:pPr>
+        <w:rPr>
+          <w:b/>
+          <w:bCs/>
+        </w:rPr>
+      </w:pPr>
+      <w:r>
+        <w:rPr>
+          <w:b/>
+          <w:bCs/>
+        </w:rPr>
+        <w:t>3. Both players connect → WebSocket → real-time communication</w:t>
+      </w:r>
+    </w:p>
+    <w:p>
+      <w:pPr>
+        <w:rPr>
+          <w:b/>
+          <w:bCs/>
+        </w:rPr>
+      </w:pPr>
+      <w:r>
+        <w:rPr>
+          <w:b/>
+          <w:bCs/>
+        </w:rPr>
+        <w:t>4. Player makes move → WebSocket message → broadcast to all players</w:t>
+      </w:r>
+    </w:p>
+    <w:p>
+      <w:pPr>
+        <w:rPr>
+          <w:b/>
+          <w:bCs/>
+        </w:rPr>
+      </w:pPr>
+      <w:r>
+        <w:rPr>
+          <w:b/>
+          <w:bCs/>
+        </w:rPr>
+        <w:t>5. Game state updates → WebSocket broadcast → UI updates for all players</w:t>
+      </w:r>
+    </w:p>
+    <w:p>
+      <w:pPr>
+        <w:rPr>
+          <w:b/>
+          <w:bCs/>
+        </w:rPr>
+      </w:pPr>
+    </w:p>
+    <w:p>
+      <w:pPr>
+        <w:rPr>
+          <w:b/>
+          <w:bCs/>
+        </w:rPr>
+      </w:pPr>
+      <w:r>
+        <w:rPr>
+          <w:b/>
+          <w:bCs/>
+        </w:rPr>
+        <w:t>## Key Features</w:t>
+      </w:r>
+    </w:p>
+    <w:p>
+      <w:pPr>
+        <w:rPr>
+          <w:b/>
+          <w:bCs/>
+        </w:rPr>
+      </w:pPr>
+      <w:r>
+        <w:rPr>
+          <w:b/>
+          <w:bCs/>
+        </w:rPr>
+        <w:t>-  Real-time multiplayer gameplay via WebSocket</w:t>
+      </w:r>
+    </w:p>
+    <w:p>
+      <w:pPr>
+        <w:rPr>
+          <w:b/>
+          <w:bCs/>
+        </w:rPr>
+      </w:pPr>
+      <w:r>
+        <w:rPr>
+          <w:b/>
+          <w:bCs/>
+        </w:rPr>
+        <w:t>- Session management for multiple games</w:t>
+      </w:r>
+    </w:p>
+    <w:p>
+      <w:pPr>
+        <w:rPr>
+          <w:b/>
+          <w:bCs/>
+        </w:rPr>
+      </w:pPr>
+      <w:r>
+        <w:rPr>
+          <w:b/>
+          <w:bCs/>
+        </w:rPr>
+        <w:t>-  Turn-based play with validation</w:t>
+      </w:r>
+    </w:p>
+    <w:p>
+      <w:pPr>
+        <w:rPr>
+          <w:b/>
+          <w:bCs/>
+        </w:rPr>
+      </w:pPr>
+      <w:r>
+        <w:rPr>
+          <w:b/>
+          <w:bCs/>
+        </w:rPr>
+        <w:t>-Win detection (horizontal, vertical, diagonal)</w:t>
+      </w:r>
+    </w:p>
+    <w:p>
+      <w:pPr>
+        <w:rPr>
+          <w:b/>
+          <w:bCs/>
+        </w:rPr>
+      </w:pPr>
+      <w:r>
+        <w:rPr>
+          <w:b/>
+          <w:bCs/>
+        </w:rPr>
+        <w:t>- Draw detection</w:t>
+      </w:r>
+    </w:p>
+    <w:p>
+      <w:pPr>
+        <w:rPr>
+          <w:b/>
+          <w:bCs/>
+        </w:rPr>
+      </w:pPr>
+      <w:r>
+        <w:rPr>
+          <w:b/>
+          <w:bCs/>
+        </w:rPr>
+        <w:lastRenderedPageBreak/>
+        <w:t>- Player disconnection handling</w:t>
+      </w:r>
+    </w:p>
+    <w:p>
+      <w:pPr>
+        <w:rPr>
+          <w:b/>
+          <w:bCs/>
+        </w:rPr>
+      </w:pPr>
+      <w:r>
+        <w:rPr>
+          <w:b/>
+          <w:bCs/>
+        </w:rPr>
+        <w:t>- Responsive UI</w:t>
+      </w:r>
+    </w:p>
+    <w:p>
+      <w:pPr>
+        <w:rPr>
+          <w:b/>
+          <w:bCs/>
+        </w:rPr>
+      </w:pPr>
+    </w:p>
+    <w:p>
+      <w:pPr>
+        <w:rPr>
+          <w:b/>
+          <w:bCs/>
+        </w:rPr>
+      </w:pPr>
+      <w:r>
+        <w:rPr>
+          <w:b/>
+          <w:bCs/>
+        </w:rPr>
+        <w:t>--</w:t>
+      </w:r>
+    </w:p>
+    <w:p>
+      <w:pPr>
+        <w:rPr>
+          <w:b/>
+          <w:bCs/>
+        </w:rPr>
+      </w:pPr>
+      <w:r>
+        <w:rPr>
+          <w:b/>
+          <w:bCs/>
+        </w:rPr>
+        <w:t>## Lessons Learned</w:t>
+      </w:r>
+    </w:p>
+    <w:p>
+      <w:pPr>
+        <w:rPr>
+          <w:b/>
+          <w:bCs/>
+        </w:rPr>
+      </w:pPr>
+      <w:r>
+        <w:rPr>
+          <w:b/>
+          <w:bCs/>
+        </w:rPr>
+        <w:t>1. WebSocket provides superior real-time communication compared to polling</w:t>
+      </w:r>
+    </w:p>
+    <w:p>
+      <w:pPr>
+        <w:rPr>
+          <w:b/>
+          <w:bCs/>
+        </w:rPr>
+      </w:pPr>
+      <w:r>
+        <w:rPr>
+          <w:b/>
+          <w:bCs/>
+        </w:rPr>
+        <w:t>2. Proper session management is crucial for multiplayer applications</w:t>
+      </w:r>
+    </w:p>
+    <w:p>
+      <w:pPr>
+        <w:rPr>
+          <w:b/>
+          <w:bCs/>
+        </w:rPr>
+      </w:pPr>
+      <w:r>
+        <w:rPr>
+          <w:b/>
+          <w:bCs/>
+        </w:rPr>
+        <w:t>3. Design patterns help maintain clean, testable, and maintainable code</w:t>
+      </w:r>
+    </w:p>
+    <w:p>
+      <w:pPr>
+        <w:rPr>
+          <w:b/>
+          <w:bCs/>
+        </w:rPr>
+      </w:pPr>
+      <w:r>
+        <w:rPr>
+          <w:b/>
+          <w:bCs/>
+        </w:rPr>
+        <w:t>4. Separation of concerns (MVC) improves code organization</w:t>
+      </w:r>
+    </w:p>
+    <w:p>
+      <w:pPr>
+        <w:rPr>
+          <w:b/>
+          <w:bCs/>
+        </w:rPr>
+      </w:pPr>
+      <w:r>
+        <w:rPr>
+          <w:b/>
+          <w:bCs/>
+        </w:rPr>
+        <w:t>5. Unit testing is essential for reliable game logic</w:t>
+      </w:r>
+    </w:p>
+    <w:p>
+      <w:pPr>
+        <w:rPr>
+          <w:b/>
+          <w:bCs/>
+        </w:rPr>
+      </w:pPr>
+      <w:r>
+        <w:rPr>
+          <w:b/>
+          <w:bCs/>
+        </w:rPr>
+        <w:t>*Documentation created: June 2026*</w:t>
+      </w:r>
     </w:p>
     <w:sectPr>
       <w:pgSz w:w="11906" w:h="16838"/>
@@ -1027,6 +4465,7 @@
   <w:style w:type="character" w:default="1" w:styleId="DefaultParagraphFont">
     <w:name w:val="Default Paragraph Font"/>
     <w:uiPriority w:val="1"/>
+    <w:semiHidden/>
     <w:unhideWhenUsed/>
   </w:style>
   <w:style w:type="table" w:default="1" w:styleId="TableNormal">

</xml_diff>